<commit_message>
Medic8 Batch 2: fix CLAUDE.md writing standards violations in Phase 01 docs
- 05-product-scope.md: converted ~200 bold structural labels to #### ATX subheadings and plain text
- 03-market-analysis.md: removed bold from TOTAL summary rows in TCO tables
- 03-market-opportunity.md: removed bold from TOTAL TAM/SAM/TOTAL summary rows
- 05-competitive-analysis.md: removed bold from TOTAL rows in TCO tables
- 07-risks.md: blank line before Probability-Impact Matrix code block already present — no change required

Co-Authored-By: Claude Sonnet 4.6 <noreply@anthropic.com>
</commit_message>
<xml_diff>
--- a/projects/Medic8/01-strategic-vision/Medic8_BusinessCase.docx
+++ b/projects/Medic8/01-strategic-vision/Medic8_BusinessCase.docx
@@ -1728,10 +1728,6 @@
               <w:pStyle w:val="Compact"/>
             </w:pPr>
             <w:r>
-              <w:rPr>
-                <w:b/>
-                <w:bCs/>
-              </w:rPr>
               <w:t xml:space="preserve">TOTAL TAM (Uganda)</w:t>
             </w:r>
           </w:p>
@@ -1743,10 +1739,6 @@
               <w:pStyle w:val="Compact"/>
             </w:pPr>
             <w:r>
-              <w:rPr>
-                <w:b/>
-                <w:bCs/>
-              </w:rPr>
               <w:t xml:space="preserve">~7,176</w:t>
             </w:r>
           </w:p>
@@ -1766,10 +1758,6 @@
               <w:pStyle w:val="Compact"/>
             </w:pPr>
             <w:r>
-              <w:rPr>
-                <w:b/>
-                <w:bCs/>
-              </w:rPr>
               <w:t xml:space="preserve">22,740,000,000</w:t>
             </w:r>
           </w:p>
@@ -1781,10 +1769,6 @@
               <w:pStyle w:val="Compact"/>
             </w:pPr>
             <w:r>
-              <w:rPr>
-                <w:b/>
-                <w:bCs/>
-              </w:rPr>
               <w:t xml:space="preserve">~6,064,000</w:t>
             </w:r>
           </w:p>
@@ -2116,10 +2100,6 @@
               <w:pStyle w:val="Compact"/>
             </w:pPr>
             <w:r>
-              <w:rPr>
-                <w:b/>
-                <w:bCs/>
-              </w:rPr>
               <w:t xml:space="preserve">TOTAL SAM (Uganda)</w:t>
             </w:r>
           </w:p>
@@ -2131,10 +2111,6 @@
               <w:pStyle w:val="Compact"/>
             </w:pPr>
             <w:r>
-              <w:rPr>
-                <w:b/>
-                <w:bCs/>
-              </w:rPr>
               <w:t xml:space="preserve">~2,010</w:t>
             </w:r>
           </w:p>
@@ -2146,10 +2122,6 @@
               <w:pStyle w:val="Compact"/>
             </w:pPr>
             <w:r>
-              <w:rPr>
-                <w:b/>
-                <w:bCs/>
-              </w:rPr>
               <w:t xml:space="preserve">5,880,000,000</w:t>
             </w:r>
           </w:p>
@@ -2161,10 +2133,6 @@
               <w:pStyle w:val="Compact"/>
             </w:pPr>
             <w:r>
-              <w:rPr>
-                <w:b/>
-                <w:bCs/>
-              </w:rPr>
               <w:t xml:space="preserve">~1,568,000</w:t>
             </w:r>
           </w:p>
@@ -4144,10 +4112,6 @@
               <w:pStyle w:val="Compact"/>
             </w:pPr>
             <w:r>
-              <w:rPr>
-                <w:b/>
-                <w:bCs/>
-              </w:rPr>
               <w:t xml:space="preserve">TOTAL</w:t>
             </w:r>
           </w:p>
@@ -4179,10 +4143,6 @@
               </m:r>
             </m:oMath>
             <w:r>
-              <w:rPr>
-                <w:b/>
-                <w:bCs/>
-              </w:rPr>
               <w:t xml:space="preserve">130,000</w:t>
             </w:r>
           </w:p>
@@ -4214,10 +4174,6 @@
               </m:r>
             </m:oMath>
             <w:r>
-              <w:rPr>
-                <w:b/>
-                <w:bCs/>
-              </w:rPr>
               <w:t xml:space="preserve">71,100</w:t>
             </w:r>
           </w:p>
@@ -4249,10 +4205,6 @@
               </m:r>
             </m:oMath>
             <w:r>
-              <w:rPr>
-                <w:b/>
-                <w:bCs/>
-              </w:rPr>
               <w:t xml:space="preserve">58,900 saved</w:t>
             </w:r>
           </w:p>
@@ -8739,10 +8691,6 @@
               <w:pStyle w:val="Compact"/>
             </w:pPr>
             <w:r>
-              <w:rPr>
-                <w:b/>
-                <w:bCs/>
-              </w:rPr>
               <w:t xml:space="preserve">TOTAL</w:t>
             </w:r>
           </w:p>
@@ -8774,10 +8722,6 @@
               </m:r>
             </m:oMath>
             <w:r>
-              <w:rPr>
-                <w:b/>
-                <w:bCs/>
-              </w:rPr>
               <w:t xml:space="preserve">130,000</w:t>
             </w:r>
           </w:p>
@@ -8809,10 +8753,6 @@
               </m:r>
             </m:oMath>
             <w:r>
-              <w:rPr>
-                <w:b/>
-                <w:bCs/>
-              </w:rPr>
               <w:t xml:space="preserve">71,100</w:t>
             </w:r>
           </w:p>
@@ -9884,10 +9824,6 @@
               <w:pStyle w:val="Compact"/>
             </w:pPr>
             <w:r>
-              <w:rPr>
-                <w:b/>
-                <w:bCs/>
-              </w:rPr>
               <w:t xml:space="preserve">TOTAL</w:t>
             </w:r>
           </w:p>
@@ -9919,10 +9855,6 @@
               </m:r>
             </m:oMath>
             <w:r>
-              <w:rPr>
-                <w:b/>
-                <w:bCs/>
-              </w:rPr>
               <w:t xml:space="preserve">150,000</w:t>
             </w:r>
           </w:p>
@@ -9954,10 +9886,6 @@
               </m:r>
             </m:oMath>
             <w:r>
-              <w:rPr>
-                <w:b/>
-                <w:bCs/>
-              </w:rPr>
               <w:t xml:space="preserve">71,100</w:t>
             </w:r>
           </w:p>
@@ -9989,10 +9917,6 @@
               </m:r>
             </m:oMath>
             <w:r>
-              <w:rPr>
-                <w:b/>
-                <w:bCs/>
-              </w:rPr>
               <w:t xml:space="preserve">78,900 saved</w:t>
             </w:r>
           </w:p>

</xml_diff>